<commit_message>
Reemplazar diagrama ASCII por imagen vectorizada (matplotlib)
</commit_message>
<xml_diff>
--- a/reporte/informe_tecnico.docx
+++ b/reporte/informe_tecnico.docx
@@ -1681,63 +1681,54 @@
       </w:r>
     </w:p>
     <w:p>
+      <w:pPr>
+        <w:jc w:val="center"/>
+      </w:pPr>
+      <w:r>
+        <w:drawing>
+          <wp:inline xmlns:a="http://schemas.openxmlformats.org/drawingml/2006/main" xmlns:pic="http://schemas.openxmlformats.org/drawingml/2006/picture">
+            <wp:extent cx="5760000" cy="4450909"/>
+            <wp:docPr id="1" name="Picture 1"/>
+            <wp:cNvGraphicFramePr>
+              <a:graphicFrameLocks noChangeAspect="1"/>
+            </wp:cNvGraphicFramePr>
+            <a:graphic>
+              <a:graphicData uri="http://schemas.openxmlformats.org/drawingml/2006/picture">
+                <pic:pic>
+                  <pic:nvPicPr>
+                    <pic:cNvPr id="0" name="pipeline_diagram.png"/>
+                    <pic:cNvPicPr/>
+                  </pic:nvPicPr>
+                  <pic:blipFill>
+                    <a:blip r:embed="rId9"/>
+                    <a:stretch>
+                      <a:fillRect/>
+                    </a:stretch>
+                  </pic:blipFill>
+                  <pic:spPr>
+                    <a:xfrm>
+                      <a:off x="0" y="0"/>
+                      <a:ext cx="5760000" cy="4450909"/>
+                    </a:xfrm>
+                    <a:prstGeom prst="rect"/>
+                  </pic:spPr>
+                </pic:pic>
+              </a:graphicData>
+            </a:graphic>
+          </wp:inline>
+        </w:drawing>
+      </w:r>
+    </w:p>
+    <w:p>
+      <w:pPr>
+        <w:jc w:val="center"/>
+      </w:pPr>
       <w:r>
         <w:rPr>
-          <w:rFonts w:ascii="Consolas" w:hAnsi="Consolas"/>
+          <w:i/>
           <w:sz w:val="18"/>
         </w:rPr>
-        <w:t>┌─────────────────┐    ┌──────────────────┐    ┌────────────────────┐</w:t>
-        <w:br/>
-        <w:t>│   1. Ingesta    │ →  │ 2. Procesamiento │ →  │  3. Vectorización  │</w:t>
-        <w:br/>
-        <w:t>│ mail crudo      │    │ (PII redaction*) │    │ multilingual-e5-large│</w:t>
-        <w:br/>
-        <w:t>└─────────────────┘    └──────────────────┘    └─────────┬──────────┘</w:t>
-        <w:br/>
-        <w:t xml:space="preserve">                                                          │</w:t>
-        <w:br/>
-        <w:t xml:space="preserve">                                                          ▼</w:t>
-        <w:br/>
-        <w:t xml:space="preserve">             ┌────────────────────────────────────────────────────┐</w:t>
-        <w:br/>
-        <w:t xml:space="preserve">             │             4. Recuperación híbrida                │</w:t>
-        <w:br/>
-        <w:t xml:space="preserve">             │   ┌──────────┐     ┌──────────────┐                │</w:t>
-        <w:br/>
-        <w:t xml:space="preserve">             │   │   BM25   │  +  │ Chroma + e5  │  →  RRF (k=60) │</w:t>
-        <w:br/>
-        <w:t xml:space="preserve">             │   └──────────┘     └──────────────┘                │</w:t>
-        <w:br/>
-        <w:t xml:space="preserve">             └─────────────────────────┬──────────────────────────┘</w:t>
-        <w:br/>
-        <w:t xml:space="preserve">                                       │</w:t>
-        <w:br/>
-        <w:t xml:space="preserve">                                       ▼</w:t>
-        <w:br/>
-        <w:t xml:space="preserve">             ┌────────────────────────────────────────────────────┐</w:t>
-        <w:br/>
-        <w:t xml:space="preserve">             │             5. Generación con LLM                   │</w:t>
-        <w:br/>
-        <w:t xml:space="preserve">             │   Gemini 2.5 Flash Lite + system prompt RAG +       │</w:t>
-        <w:br/>
-        <w:t xml:space="preserve">             │   Pydantic schema (response_schema=MailAnalysis)    │</w:t>
-        <w:br/>
-        <w:t xml:space="preserve">             └─────────────────────────┬──────────────────────────┘</w:t>
-        <w:br/>
-        <w:t xml:space="preserve">                                       │</w:t>
-        <w:br/>
-        <w:t xml:space="preserve">                                       ▼</w:t>
-        <w:br/>
-        <w:t xml:space="preserve">                       MailAnalysis (JSON validado)</w:t>
-        <w:br/>
-        <w:t xml:space="preserve">                       {intent, confidence, summary, urgency,</w:t>
-        <w:br/>
-        <w:t xml:space="preserve">                        language, entities, suggested_response, sources}</w:t>
-        <w:br/>
-        <w:br/>
-        <w:t>* PII redaction: en el alcance del PoC se diseñó pero no se implementó.</w:t>
-        <w:br/>
-        <w:t xml:space="preserve">  Ver Conclusiones (Sección 6) para trabajo futuro.</w:t>
+        <w:t>Figura 1. Pipeline del sistema. La estrella (*) indica que la etapa de PII redaction fue diseñada pero no implementada en el PoC.</w:t>
       </w:r>
     </w:p>
     <w:p>

</xml_diff>